<commit_message>
fix(s1): only Субподрядчик and Заказчик in buyer files; test forbids third parties (#269 review)
Removes the Инвестор row from KS-2/KS-3 (cells unchanged) and the
«Иные участники» row from file 06, replaces the categorical sentence in
file 10 with the owner's wording, and widens the buyer-file check to
forbid Подрядчик, Генподрядчик, Инвестор and Иные участники as a class.

Co-Authored-By: Claude Opus 5.5 <noreply@anthropic.com>
Claude-Session: https://claude.ai/code/session_01UmCUuQToGDpJHXok26LuA6
</commit_message>
<xml_diff>
--- a/tools/candidates/s1-oplata-za-raboty/06-akt-priemki-rezultata.docx
+++ b/tools/candidates/s1-oplata-za-raboty/06-akt-priemki-rezultata.docx
@@ -165,34 +165,6 @@
           <w:p>
             <w:r>
               <w:t>Субподрядчик</w:t>
-            </w:r>
-          </w:p>
-        </w:tc>
-        <w:tc>
-          <w:tcPr>
-            <w:tcW w:type="dxa" w:w="2880"/>
-          </w:tcPr>
-          <w:p>
-            <w:r/>
-          </w:p>
-        </w:tc>
-        <w:tc>
-          <w:tcPr>
-            <w:tcW w:type="dxa" w:w="2880"/>
-          </w:tcPr>
-          <w:p>
-            <w:r/>
-          </w:p>
-        </w:tc>
-      </w:tr>
-      <w:tr>
-        <w:tc>
-          <w:tcPr>
-            <w:tcW w:type="dxa" w:w="2880"/>
-          </w:tcPr>
-          <w:p>
-            <w:r>
-              <w:t>Иные участники</w:t>
             </w:r>
           </w:p>
         </w:tc>

</xml_diff>